<commit_message>
delete: remove outdated Excel file for 20251024 version
</commit_message>
<xml_diff>
--- a/問答錄2/审核要求.docx
+++ b/問答錄2/审核要求.docx
@@ -21,6 +21,319 @@
           <w:szCs w:val="28"/>
           <w:lang w:eastAsia="zh-TW"/>
         </w:rPr>
+        <w:t>**改写说明**：</w:t>
+      </w:r>
+    </w:p>
+    <w:p>
+      <w:pPr>
+        <w:spacing w:line="360" w:lineRule="auto"/>
+        <w:rPr>
+          <w:b/>
+          <w:bCs/>
+          <w:sz w:val="28"/>
+          <w:szCs w:val="28"/>
+          <w:lang w:eastAsia="zh-TW"/>
+        </w:rPr>
+      </w:pPr>
+      <w:r>
+        <w:rPr>
+          <w:b/>
+          <w:bCs/>
+          <w:sz w:val="28"/>
+          <w:szCs w:val="28"/>
+          <w:lang w:eastAsia="zh-TW"/>
+        </w:rPr>
+        <w:t>- **理顺语句结构，增强条理性**：对原文内容进行分层和顺序调整，使表达更有逻辑和层次。</w:t>
+      </w:r>
+    </w:p>
+    <w:p>
+      <w:pPr>
+        <w:spacing w:line="360" w:lineRule="auto"/>
+        <w:rPr>
+          <w:b/>
+          <w:bCs/>
+          <w:sz w:val="28"/>
+          <w:szCs w:val="28"/>
+          <w:lang w:eastAsia="zh-TW"/>
+        </w:rPr>
+      </w:pPr>
+      <w:r>
+        <w:rPr>
+          <w:b/>
+          <w:bCs/>
+          <w:sz w:val="28"/>
+          <w:szCs w:val="28"/>
+          <w:lang w:eastAsia="zh-TW"/>
+        </w:rPr>
+        <w:t>- **书面化表达，减少口语化**：将口头用语和随意表达转为正式、凝练的书面语句，保持庄重氛围。</w:t>
+      </w:r>
+    </w:p>
+    <w:p>
+      <w:pPr>
+        <w:spacing w:line="360" w:lineRule="auto"/>
+        <w:rPr>
+          <w:b/>
+          <w:bCs/>
+          <w:sz w:val="28"/>
+          <w:szCs w:val="28"/>
+          <w:lang w:eastAsia="zh-TW"/>
+        </w:rPr>
+      </w:pPr>
+      <w:r>
+        <w:rPr>
+          <w:b/>
+          <w:bCs/>
+          <w:sz w:val="28"/>
+          <w:szCs w:val="28"/>
+          <w:lang w:eastAsia="zh-TW"/>
+        </w:rPr>
+        <w:t>- **精炼内容，去除重复**：合并和删减原文中重复或冗余的表述，使内容更简明连贯。</w:t>
+      </w:r>
+    </w:p>
+    <w:p>
+      <w:pPr>
+        <w:spacing w:line="360" w:lineRule="auto"/>
+        <w:rPr>
+          <w:b/>
+          <w:bCs/>
+          <w:sz w:val="28"/>
+          <w:szCs w:val="28"/>
+          <w:lang w:eastAsia="zh-TW"/>
+        </w:rPr>
+      </w:pPr>
+    </w:p>
+    <w:p>
+      <w:pPr>
+        <w:spacing w:line="360" w:lineRule="auto"/>
+        <w:rPr>
+          <w:b/>
+          <w:bCs/>
+          <w:sz w:val="28"/>
+          <w:szCs w:val="28"/>
+          <w:lang w:eastAsia="zh-TW"/>
+        </w:rPr>
+      </w:pPr>
+      <w:r>
+        <w:rPr>
+          <w:b/>
+          <w:bCs/>
+          <w:sz w:val="28"/>
+          <w:szCs w:val="28"/>
+          <w:lang w:eastAsia="zh-TW"/>
+        </w:rPr>
+        <w:t>使语句更通顺流畅，逻辑更清晰；</w:t>
+      </w:r>
+    </w:p>
+    <w:p>
+      <w:pPr>
+        <w:spacing w:line="360" w:lineRule="auto"/>
+        <w:rPr>
+          <w:b/>
+          <w:bCs/>
+          <w:sz w:val="28"/>
+          <w:szCs w:val="28"/>
+          <w:lang w:eastAsia="zh-TW"/>
+        </w:rPr>
+      </w:pPr>
+      <w:r>
+        <w:rPr>
+          <w:b/>
+          <w:bCs/>
+          <w:sz w:val="28"/>
+          <w:szCs w:val="28"/>
+          <w:lang w:eastAsia="zh-TW"/>
+        </w:rPr>
+        <w:t>- 减少口语化表达，采用更正式、书面化的语言；</w:t>
+      </w:r>
+    </w:p>
+    <w:p>
+      <w:pPr>
+        <w:spacing w:line="360" w:lineRule="auto"/>
+        <w:rPr>
+          <w:b/>
+          <w:bCs/>
+          <w:sz w:val="28"/>
+          <w:szCs w:val="28"/>
+          <w:lang w:eastAsia="zh-TW"/>
+        </w:rPr>
+      </w:pPr>
+      <w:r>
+        <w:rPr>
+          <w:b/>
+          <w:bCs/>
+          <w:sz w:val="28"/>
+          <w:szCs w:val="28"/>
+          <w:lang w:eastAsia="zh-TW"/>
+        </w:rPr>
+        <w:t>- 保持原意不变，确保核心观点完整保留；</w:t>
+      </w:r>
+    </w:p>
+    <w:p>
+      <w:pPr>
+        <w:spacing w:line="360" w:lineRule="auto"/>
+        <w:rPr>
+          <w:b/>
+          <w:bCs/>
+          <w:sz w:val="28"/>
+          <w:szCs w:val="28"/>
+          <w:lang w:eastAsia="zh-TW"/>
+        </w:rPr>
+      </w:pPr>
+      <w:r>
+        <w:rPr>
+          <w:b/>
+          <w:bCs/>
+          <w:sz w:val="28"/>
+          <w:szCs w:val="28"/>
+          <w:lang w:eastAsia="zh-TW"/>
+        </w:rPr>
+        <w:t>- 删除重复内容，合并相似论述，使文本更简洁。</w:t>
+      </w:r>
+    </w:p>
+    <w:p>
+      <w:pPr>
+        <w:spacing w:line="360" w:lineRule="auto"/>
+        <w:rPr>
+          <w:b/>
+          <w:bCs/>
+          <w:sz w:val="28"/>
+          <w:szCs w:val="28"/>
+          <w:lang w:eastAsia="zh-TW"/>
+        </w:rPr>
+      </w:pPr>
+    </w:p>
+    <w:p>
+      <w:pPr>
+        <w:spacing w:line="360" w:lineRule="auto"/>
+        <w:rPr>
+          <w:b/>
+          <w:bCs/>
+          <w:sz w:val="28"/>
+          <w:szCs w:val="28"/>
+          <w:lang w:eastAsia="zh-TW"/>
+        </w:rPr>
+      </w:pPr>
+      <w:r>
+        <w:rPr>
+          <w:b/>
+          <w:bCs/>
+          <w:sz w:val="28"/>
+          <w:szCs w:val="28"/>
+          <w:lang w:eastAsia="zh-TW"/>
+        </w:rPr>
+        <w:t>使语句通顺、减少口语化、保持原意，并删除重复内容。</w:t>
+      </w:r>
+    </w:p>
+    <w:p>
+      <w:pPr>
+        <w:spacing w:line="360" w:lineRule="auto"/>
+        <w:rPr>
+          <w:b/>
+          <w:bCs/>
+          <w:sz w:val="28"/>
+          <w:szCs w:val="28"/>
+          <w:lang w:eastAsia="zh-TW"/>
+        </w:rPr>
+      </w:pPr>
+    </w:p>
+    <w:p>
+      <w:pPr>
+        <w:spacing w:line="360" w:lineRule="auto"/>
+        <w:rPr>
+          <w:b/>
+          <w:bCs/>
+          <w:sz w:val="28"/>
+          <w:szCs w:val="28"/>
+          <w:lang w:eastAsia="zh-TW"/>
+        </w:rPr>
+      </w:pPr>
+      <w:r>
+        <w:rPr>
+          <w:b/>
+          <w:bCs/>
+          <w:sz w:val="28"/>
+          <w:szCs w:val="28"/>
+          <w:lang w:eastAsia="zh-TW"/>
+        </w:rPr>
+        <w:t>- **优化语句通顺与结构逻辑**：调整原文语序和句式，消除口语化表达，使内容更连贯、条理更清晰。</w:t>
+      </w:r>
+    </w:p>
+    <w:p>
+      <w:pPr>
+        <w:spacing w:line="360" w:lineRule="auto"/>
+        <w:rPr>
+          <w:b/>
+          <w:bCs/>
+          <w:sz w:val="28"/>
+          <w:szCs w:val="28"/>
+          <w:lang w:eastAsia="zh-TW"/>
+        </w:rPr>
+      </w:pPr>
+      <w:r>
+        <w:rPr>
+          <w:b/>
+          <w:bCs/>
+          <w:sz w:val="28"/>
+          <w:szCs w:val="28"/>
+          <w:lang w:eastAsia="zh-TW"/>
+        </w:rPr>
+        <w:t>- **统一术语和表达风格**：将口语及重复表述转化为书面化、规范用语，确保整体风格正式且一致。</w:t>
+      </w:r>
+    </w:p>
+    <w:p>
+      <w:pPr>
+        <w:spacing w:line="360" w:lineRule="auto"/>
+        <w:rPr>
+          <w:b/>
+          <w:bCs/>
+          <w:sz w:val="28"/>
+          <w:szCs w:val="28"/>
+          <w:lang w:eastAsia="zh-TW"/>
+        </w:rPr>
+      </w:pPr>
+      <w:r>
+        <w:rPr>
+          <w:b/>
+          <w:bCs/>
+          <w:sz w:val="28"/>
+          <w:szCs w:val="28"/>
+          <w:lang w:eastAsia="zh-TW"/>
+        </w:rPr>
+        <w:t>- **去除重复并精炼内容**：合并或删减原文中多次出现的相似观点，突出核心信息，避免冗余。</w:t>
+      </w:r>
+    </w:p>
+    <w:p>
+      <w:pPr>
+        <w:spacing w:line="360" w:lineRule="auto"/>
+        <w:rPr>
+          <w:b/>
+          <w:bCs/>
+          <w:sz w:val="28"/>
+          <w:szCs w:val="28"/>
+          <w:lang w:eastAsia="zh-TW"/>
+        </w:rPr>
+      </w:pPr>
+    </w:p>
+    <w:p>
+      <w:pPr>
+        <w:spacing w:line="360" w:lineRule="auto"/>
+        <w:rPr>
+          <w:b/>
+          <w:bCs/>
+          <w:sz w:val="28"/>
+          <w:szCs w:val="28"/>
+          <w:lang w:eastAsia="zh-TW"/>
+        </w:rPr>
+      </w:pPr>
+      <w:r>
+        <w:rPr>
+          <w:b/>
+          <w:bCs/>
+          <w:sz w:val="28"/>
+          <w:szCs w:val="28"/>
+          <w:lang w:eastAsia="zh-TW"/>
+        </w:rPr>
+        <w:lastRenderedPageBreak/>
         <w:t>10/1</w:t>
       </w:r>
       <w:r>

</xml_diff>

<commit_message>
delete: remove outdated Excel file for 20251028 version
</commit_message>
<xml_diff>
--- a/問答錄2/审核要求.docx
+++ b/問答錄2/审核要求.docx
@@ -21,6 +21,76 @@
           <w:szCs w:val="28"/>
           <w:lang w:eastAsia="zh-TW"/>
         </w:rPr>
+        <w:t>ChatGPT</w:t>
+      </w:r>
+      <w:r>
+        <w:rPr>
+          <w:rFonts w:hint="eastAsia"/>
+          <w:b/>
+          <w:bCs/>
+          <w:sz w:val="28"/>
+          <w:szCs w:val="28"/>
+          <w:lang w:eastAsia="zh-TW"/>
+        </w:rPr>
+        <w:t>提示詞：</w:t>
+      </w:r>
+    </w:p>
+    <w:p>
+      <w:pPr>
+        <w:spacing w:line="360" w:lineRule="auto"/>
+        <w:rPr>
+          <w:rFonts w:ascii="Heiti TC" w:eastAsia="Heiti TC" w:hAnsi="Heiti TC" w:cs="Heiti TC"/>
+        </w:rPr>
+      </w:pPr>
+      <w:r>
+        <w:t>根據問題，優化以下答案，優化原則為 - 使语句更通顺流畅，逻辑更清晰； - 减少口语化表达，采用更正式、书面化的语言； - 保持原意不变，确保核心观点完整保留； - 删除重复内容，合并相似论述，使文本更简洁</w:t>
+      </w:r>
+      <w:r>
+        <w:rPr>
+          <w:rFonts w:ascii="Heiti TC" w:eastAsia="Heiti TC" w:hAnsi="Heiti TC" w:cs="Heiti TC" w:hint="eastAsia"/>
+        </w:rPr>
+        <w:t>。</w:t>
+      </w:r>
+    </w:p>
+    <w:p>
+      <w:pPr>
+        <w:spacing w:line="360" w:lineRule="auto"/>
+        <w:rPr>
+          <w:rFonts w:ascii="Heiti TC" w:eastAsia="Heiti TC" w:hAnsi="Heiti TC" w:cs="Heiti TC"/>
+        </w:rPr>
+      </w:pPr>
+    </w:p>
+    <w:p>
+      <w:pPr>
+        <w:spacing w:line="360" w:lineRule="auto"/>
+        <w:rPr>
+          <w:b/>
+          <w:bCs/>
+          <w:sz w:val="28"/>
+          <w:szCs w:val="28"/>
+          <w:lang w:eastAsia="zh-TW"/>
+        </w:rPr>
+      </w:pPr>
+    </w:p>
+    <w:p>
+      <w:pPr>
+        <w:spacing w:line="360" w:lineRule="auto"/>
+        <w:rPr>
+          <w:b/>
+          <w:bCs/>
+          <w:sz w:val="28"/>
+          <w:szCs w:val="28"/>
+          <w:lang w:eastAsia="zh-TW"/>
+        </w:rPr>
+      </w:pPr>
+      <w:r>
+        <w:rPr>
+          <w:b/>
+          <w:bCs/>
+          <w:sz w:val="28"/>
+          <w:szCs w:val="28"/>
+          <w:lang w:eastAsia="zh-TW"/>
+        </w:rPr>
         <w:t>**改写说明**：</w:t>
       </w:r>
     </w:p>
@@ -277,6 +347,7 @@
           <w:szCs w:val="28"/>
           <w:lang w:eastAsia="zh-TW"/>
         </w:rPr>
+        <w:lastRenderedPageBreak/>
         <w:t>- **统一术语和表达风格**：将口语及重复表述转化为书面化、规范用语，确保整体风格正式且一致。</w:t>
       </w:r>
     </w:p>
@@ -333,7 +404,6 @@
           <w:szCs w:val="28"/>
           <w:lang w:eastAsia="zh-TW"/>
         </w:rPr>
-        <w:lastRenderedPageBreak/>
         <w:t>10/1</w:t>
       </w:r>
       <w:r>
@@ -722,7 +792,14 @@
         <w:rPr>
           <w:rFonts w:hint="eastAsia"/>
         </w:rPr>
-        <w:t>“问答录2主题250911”表中前四列的内容（如图1）为已有的四级分类标题。从左往右依次为一级、二级、三级和四级分类标题，这四列内容应该从左往右看，表示整个分类的结构。</w:t>
+        <w:t>“问答录2主题250911”表中前四列的内容（如图1）为已有的四级分类标题。从左往右依次为一级、二级、三级和四级分类标题，这四列内容应该从左往右看，表示整个分类的结</w:t>
+      </w:r>
+      <w:r>
+        <w:rPr>
+          <w:rFonts w:hint="eastAsia"/>
+        </w:rPr>
+        <w:lastRenderedPageBreak/>
+        <w:t>构。</w:t>
       </w:r>
     </w:p>
     <w:p>
@@ -792,7 +869,6 @@
         <w:rPr>
           <w:rFonts w:hint="eastAsia"/>
         </w:rPr>
-        <w:lastRenderedPageBreak/>
         <w:t>“答疑汇总表”中前8列（如图2）为旧版分类和新版分类标题，即当前问题所属的分类，其中旧版分类不再采用，可以忽略。主要看当前问题如果归入新版分类是否合适，如果不确定可以查《坐禅2》，看一下该问题和答案的主旨在《坐禅2》中的哪个小节中出现，以此作为分类依据。</w:t>
       </w:r>
     </w:p>
@@ -1102,19 +1178,11 @@
               <w:spacing w:line="360" w:lineRule="auto"/>
               <w:jc w:val="center"/>
             </w:pPr>
-            <w:proofErr w:type="spellStart"/>
             <w:r>
               <w:rPr>
                 <w:rFonts w:hint="eastAsia"/>
               </w:rPr>
-              <w:t>Lanlan</w:t>
-            </w:r>
-            <w:proofErr w:type="spellEnd"/>
-            <w:r>
-              <w:rPr>
-                <w:rFonts w:hint="eastAsia"/>
-              </w:rPr>
-              <w:t>岚</w:t>
+              <w:t>Lanlan岚</w:t>
             </w:r>
           </w:p>
         </w:tc>

</xml_diff>

<commit_message>
delete: remove outdated Excel file and update审核要求 document
</commit_message>
<xml_diff>
--- a/問答錄2/审核要求.docx
+++ b/問答錄2/审核要求.docx
@@ -113,164 +113,52 @@
           <w:szCs w:val="28"/>
           <w:lang w:eastAsia="zh-TW"/>
         </w:rPr>
-        <w:t>- **理顺语句结构，增强条理性**：对原文内容进行分层和顺序调整，使表达更有逻辑和层次。</w:t>
-      </w:r>
-    </w:p>
-    <w:p>
-      <w:pPr>
-        <w:spacing w:line="360" w:lineRule="auto"/>
-        <w:rPr>
-          <w:b/>
-          <w:bCs/>
-          <w:sz w:val="28"/>
-          <w:szCs w:val="28"/>
-          <w:lang w:eastAsia="zh-TW"/>
-        </w:rPr>
-      </w:pPr>
-      <w:r>
-        <w:rPr>
-          <w:b/>
-          <w:bCs/>
-          <w:sz w:val="28"/>
-          <w:szCs w:val="28"/>
-          <w:lang w:eastAsia="zh-TW"/>
-        </w:rPr>
-        <w:t>- **书面化表达，减少口语化**：将口头用语和随意表达转为正式、凝练的书面语句，保持庄重氛围。</w:t>
-      </w:r>
-    </w:p>
-    <w:p>
-      <w:pPr>
-        <w:spacing w:line="360" w:lineRule="auto"/>
-        <w:rPr>
-          <w:b/>
-          <w:bCs/>
-          <w:sz w:val="28"/>
-          <w:szCs w:val="28"/>
-          <w:lang w:eastAsia="zh-TW"/>
-        </w:rPr>
-      </w:pPr>
-      <w:r>
-        <w:rPr>
-          <w:b/>
-          <w:bCs/>
-          <w:sz w:val="28"/>
-          <w:szCs w:val="28"/>
-          <w:lang w:eastAsia="zh-TW"/>
-        </w:rPr>
-        <w:t>- **精炼内容，去除重复**：合并和删减原文中重复或冗余的表述，使内容更简明连贯。</w:t>
-      </w:r>
-    </w:p>
-    <w:p>
-      <w:pPr>
-        <w:spacing w:line="360" w:lineRule="auto"/>
-        <w:rPr>
-          <w:b/>
-          <w:bCs/>
-          <w:sz w:val="28"/>
-          <w:szCs w:val="28"/>
-          <w:lang w:eastAsia="zh-TW"/>
-        </w:rPr>
-      </w:pPr>
-    </w:p>
-    <w:p>
-      <w:pPr>
-        <w:spacing w:line="360" w:lineRule="auto"/>
-        <w:rPr>
-          <w:b/>
-          <w:bCs/>
-          <w:sz w:val="28"/>
-          <w:szCs w:val="28"/>
-          <w:lang w:eastAsia="zh-TW"/>
-        </w:rPr>
-      </w:pPr>
-      <w:r>
-        <w:rPr>
-          <w:b/>
-          <w:bCs/>
-          <w:sz w:val="28"/>
-          <w:szCs w:val="28"/>
-          <w:lang w:eastAsia="zh-TW"/>
-        </w:rPr>
-        <w:t>使语句更通顺流畅，逻辑更清晰；</w:t>
-      </w:r>
-    </w:p>
-    <w:p>
-      <w:pPr>
-        <w:spacing w:line="360" w:lineRule="auto"/>
-        <w:rPr>
-          <w:b/>
-          <w:bCs/>
-          <w:sz w:val="28"/>
-          <w:szCs w:val="28"/>
-          <w:lang w:eastAsia="zh-TW"/>
-        </w:rPr>
-      </w:pPr>
-      <w:r>
-        <w:rPr>
-          <w:b/>
-          <w:bCs/>
-          <w:sz w:val="28"/>
-          <w:szCs w:val="28"/>
-          <w:lang w:eastAsia="zh-TW"/>
-        </w:rPr>
-        <w:t>- 减少口语化表达，采用更正式、书面化的语言；</w:t>
-      </w:r>
-    </w:p>
-    <w:p>
-      <w:pPr>
-        <w:spacing w:line="360" w:lineRule="auto"/>
-        <w:rPr>
-          <w:b/>
-          <w:bCs/>
-          <w:sz w:val="28"/>
-          <w:szCs w:val="28"/>
-          <w:lang w:eastAsia="zh-TW"/>
-        </w:rPr>
-      </w:pPr>
-      <w:r>
-        <w:rPr>
-          <w:b/>
-          <w:bCs/>
-          <w:sz w:val="28"/>
-          <w:szCs w:val="28"/>
-          <w:lang w:eastAsia="zh-TW"/>
-        </w:rPr>
-        <w:t>- 保持原意不变，确保核心观点完整保留；</w:t>
-      </w:r>
-    </w:p>
-    <w:p>
-      <w:pPr>
-        <w:spacing w:line="360" w:lineRule="auto"/>
-        <w:rPr>
-          <w:b/>
-          <w:bCs/>
-          <w:sz w:val="28"/>
-          <w:szCs w:val="28"/>
-          <w:lang w:eastAsia="zh-TW"/>
-        </w:rPr>
-      </w:pPr>
-      <w:r>
-        <w:rPr>
-          <w:b/>
-          <w:bCs/>
-          <w:sz w:val="28"/>
-          <w:szCs w:val="28"/>
-          <w:lang w:eastAsia="zh-TW"/>
-        </w:rPr>
-        <w:t>- 删除重复内容，合并相似论述，使文本更简洁。</w:t>
-      </w:r>
-    </w:p>
-    <w:p>
-      <w:pPr>
-        <w:spacing w:line="360" w:lineRule="auto"/>
-        <w:rPr>
-          <w:b/>
-          <w:bCs/>
-          <w:sz w:val="28"/>
-          <w:szCs w:val="28"/>
-          <w:lang w:eastAsia="zh-TW"/>
-        </w:rPr>
-      </w:pPr>
+        <w:t>- **理顺语句结构并提升表达的连贯性与正式度**：对原文口语化、重复和跳跃的内容进行了梳理和重组，使整体表达更通顺、条理更清晰。</w:t>
+      </w:r>
+    </w:p>
+    <w:p>
+      <w:pPr>
+        <w:spacing w:line="360" w:lineRule="auto"/>
+        <w:rPr>
+          <w:b/>
+          <w:bCs/>
+          <w:sz w:val="28"/>
+          <w:szCs w:val="28"/>
+          <w:lang w:eastAsia="zh-TW"/>
+        </w:rPr>
+      </w:pPr>
+      <w:r>
+        <w:rPr>
+          <w:b/>
+          <w:bCs/>
+          <w:sz w:val="28"/>
+          <w:szCs w:val="28"/>
+          <w:lang w:eastAsia="zh-TW"/>
+        </w:rPr>
+        <w:t>- **抽象和归纳原有观点，增强逻辑层次**：将分散的议论整合为有条理的论述，突出身心关系、智慧和修行的主线。</w:t>
+      </w:r>
+    </w:p>
+    <w:p>
+      <w:pPr>
+        <w:spacing w:line="360" w:lineRule="auto"/>
+        <w:rPr>
+          <w:b/>
+          <w:bCs/>
+          <w:sz w:val="28"/>
+          <w:szCs w:val="28"/>
+          <w:lang w:eastAsia="zh-TW"/>
+        </w:rPr>
+      </w:pPr>
+      <w:r>
+        <w:rPr>
+          <w:b/>
+          <w:bCs/>
+          <w:sz w:val="28"/>
+          <w:szCs w:val="28"/>
+          <w:lang w:eastAsia="zh-TW"/>
+        </w:rPr>
+        <w:t>- **保留原有术语和修行实践例证**：对“报身”“念佛打坐”等术语及实际案例予以保留，确保内容原意和修行语境不变。</w:t>
+      </w:r>
     </w:p>
     <w:p>
       <w:pPr>
@@ -292,85 +180,6 @@
           <w:lang w:eastAsia="zh-TW"/>
         </w:rPr>
         <w:t>使语句通顺、减少口语化、保持原意，并删除重复内容。</w:t>
-      </w:r>
-    </w:p>
-    <w:p>
-      <w:pPr>
-        <w:spacing w:line="360" w:lineRule="auto"/>
-        <w:rPr>
-          <w:b/>
-          <w:bCs/>
-          <w:sz w:val="28"/>
-          <w:szCs w:val="28"/>
-          <w:lang w:eastAsia="zh-TW"/>
-        </w:rPr>
-      </w:pPr>
-    </w:p>
-    <w:p>
-      <w:pPr>
-        <w:spacing w:line="360" w:lineRule="auto"/>
-        <w:rPr>
-          <w:b/>
-          <w:bCs/>
-          <w:sz w:val="28"/>
-          <w:szCs w:val="28"/>
-          <w:lang w:eastAsia="zh-TW"/>
-        </w:rPr>
-      </w:pPr>
-      <w:r>
-        <w:rPr>
-          <w:b/>
-          <w:bCs/>
-          <w:sz w:val="28"/>
-          <w:szCs w:val="28"/>
-          <w:lang w:eastAsia="zh-TW"/>
-        </w:rPr>
-        <w:t>- **优化语句通顺与结构逻辑**：调整原文语序和句式，消除口语化表达，使内容更连贯、条理更清晰。</w:t>
-      </w:r>
-    </w:p>
-    <w:p>
-      <w:pPr>
-        <w:spacing w:line="360" w:lineRule="auto"/>
-        <w:rPr>
-          <w:b/>
-          <w:bCs/>
-          <w:sz w:val="28"/>
-          <w:szCs w:val="28"/>
-          <w:lang w:eastAsia="zh-TW"/>
-        </w:rPr>
-      </w:pPr>
-      <w:r>
-        <w:rPr>
-          <w:b/>
-          <w:bCs/>
-          <w:sz w:val="28"/>
-          <w:szCs w:val="28"/>
-          <w:lang w:eastAsia="zh-TW"/>
-        </w:rPr>
-        <w:lastRenderedPageBreak/>
-        <w:t>- **统一术语和表达风格**：将口语及重复表述转化为书面化、规范用语，确保整体风格正式且一致。</w:t>
-      </w:r>
-    </w:p>
-    <w:p>
-      <w:pPr>
-        <w:spacing w:line="360" w:lineRule="auto"/>
-        <w:rPr>
-          <w:b/>
-          <w:bCs/>
-          <w:sz w:val="28"/>
-          <w:szCs w:val="28"/>
-          <w:lang w:eastAsia="zh-TW"/>
-        </w:rPr>
-      </w:pPr>
-      <w:r>
-        <w:rPr>
-          <w:b/>
-          <w:bCs/>
-          <w:sz w:val="28"/>
-          <w:szCs w:val="28"/>
-          <w:lang w:eastAsia="zh-TW"/>
-        </w:rPr>
-        <w:t>- **去除重复并精炼内容**：合并或删减原文中多次出现的相似观点，突出核心信息，避免冗余。</w:t>
       </w:r>
     </w:p>
     <w:p>
@@ -596,6 +405,7 @@
         <w:rPr>
           <w:rFonts w:hint="eastAsia"/>
         </w:rPr>
+        <w:lastRenderedPageBreak/>
         <w:t>对“答疑汇总”表中“答案”和“优化的答案”这两列的内容，认真阅读</w:t>
       </w:r>
       <w:r>
@@ -792,14 +602,7 @@
         <w:rPr>
           <w:rFonts w:hint="eastAsia"/>
         </w:rPr>
-        <w:t>“问答录2主题250911”表中前四列的内容（如图1）为已有的四级分类标题。从左往右依次为一级、二级、三级和四级分类标题，这四列内容应该从左往右看，表示整个分类的结</w:t>
-      </w:r>
-      <w:r>
-        <w:rPr>
-          <w:rFonts w:hint="eastAsia"/>
-        </w:rPr>
-        <w:lastRenderedPageBreak/>
-        <w:t>构。</w:t>
+        <w:t>“问答录2主题250911”表中前四列的内容（如图1）为已有的四级分类标题。从左往右依次为一级、二级、三级和四级分类标题，这四列内容应该从左往右看，表示整个分类的结构。</w:t>
       </w:r>
     </w:p>
     <w:p>
@@ -957,7 +760,14 @@
         <w:rPr>
           <w:rFonts w:hint="eastAsia"/>
         </w:rPr>
-        <w:t>其中“分类调整”列填“是”，四级</w:t>
+        <w:t>其中“分类调整”列填</w:t>
+      </w:r>
+      <w:r>
+        <w:rPr>
+          <w:rFonts w:hint="eastAsia"/>
+        </w:rPr>
+        <w:lastRenderedPageBreak/>
+        <w:t>“是”，四级</w:t>
       </w:r>
       <w:r>
         <w:rPr>
@@ -1178,11 +988,19 @@
               <w:spacing w:line="360" w:lineRule="auto"/>
               <w:jc w:val="center"/>
             </w:pPr>
+            <w:proofErr w:type="spellStart"/>
             <w:r>
               <w:rPr>
                 <w:rFonts w:hint="eastAsia"/>
               </w:rPr>
-              <w:t>Lanlan岚</w:t>
+              <w:t>Lanlan</w:t>
+            </w:r>
+            <w:proofErr w:type="spellEnd"/>
+            <w:r>
+              <w:rPr>
+                <w:rFonts w:hint="eastAsia"/>
+              </w:rPr>
+              <w:t>岚</w:t>
             </w:r>
           </w:p>
         </w:tc>

</xml_diff>